<commit_message>
Add the Zenodo DOI to the paper, citation file and README
</commit_message>
<xml_diff>
--- a/v2/paper_ems/Manuscript_EMS.docx
+++ b/v2/paper_ems/Manuscript_EMS.docx
@@ -129,7 +129,7 @@
         </w:numPr>
       </w:pPr>
       <w:r>
-        <w:t xml:space="preserve">Name: Bangladesh-Agri-Research, v2 pipeline</w:t>
+        <w:t xml:space="preserve">Name: bd-boro-data-framework</w:t>
       </w:r>
     </w:p>
     <w:p>
@@ -225,7 +225,7 @@
         </w:numPr>
       </w:pPr>
       <w:r>
-        <w:t xml:space="preserve">Availability: https://github.com/TasMumu/bd-boro-data-framework (folder v2) [authors: archive a tagged release, for example on Zenodo, and give its DOI here before submission]</w:t>
+        <w:t xml:space="preserve">Availability: https://github.com/TasMumu/bd-boro-data-framework (folder v2); the version described here is archived on Zenodo at https://doi.org/10.5281/zenodo.23795046</w:t>
       </w:r>
     </w:p>
     <w:p>
@@ -9108,7 +9108,7 @@
         <w:pStyle w:val="FirstParagraph"/>
       </w:pPr>
       <w:r>
-        <w:t xml:space="preserve">The code (MIT licence) and the derived data are available in the repository given in the Software and data availability section; the derived data remain subject to the terms of their sources (Table 2). The BBS yearbook PDFs and the GADM v4.1 boundaries are not redistributed and must be obtained from the Bangladesh Bureau of Statistics and gadm.org; the manifest in the repository lists the SHA-256 checksum of each file used.</w:t>
+        <w:t xml:space="preserve">The code (MIT licence) and the derived data are available in the repository given in the Software and data availability section and archived at https://doi.org/10.5281/zenodo.23795046; the derived data remain subject to the terms of their sources (Table 2). The BBS yearbook PDFs and the GADM v4.1 boundaries are not redistributed and must be obtained from the Bangladesh Bureau of Statistics and gadm.org; the manifest in the repository lists the SHA-256 checksum of each file used.</w:t>
       </w:r>
     </w:p>
     <w:bookmarkEnd w:id="71"/>

</xml_diff>

<commit_message>
Correct the BBS method wording and report Chandpur's 2016-17 area
State the method as the yearbook gives it: crop cuts on plots in fields
growing the crop, area from sample clusters, and production as their product.
Add BBS's statement on the Boro area fully damaged in 2016-17.

Chandpur's 2016-17 area appears to be an error in the yearbooks, which print
the same area for HYV and hybrid Boro that year. It is kept as printed and
reported in the manuscript and the README. Expand the README.
</commit_message>
<xml_diff>
--- a/v2/paper_ems/Manuscript_EMS.docx
+++ b/v2/paper_ems/Manuscript_EMS.docx
@@ -213,7 +213,7 @@
         </w:numPr>
       </w:pPr>
       <w:r>
-        <w:t xml:space="preserve">Program size: 3,314 lines of code (174 KB), plus the test scripts</w:t>
+        <w:t xml:space="preserve">Program size: 3,315 lines of code (174 KB), plus the test scripts</w:t>
       </w:r>
     </w:p>
     <w:p>
@@ -3030,7 +3030,7 @@
         <w:pStyle w:val="FirstParagraph"/>
       </w:pPr>
       <w:r>
-        <w:t xml:space="preserve">Every BBS value in the Gold panel carries the yearbook edition and page from which it was read. A manifest written on every run lists each source file and extract with its SHA-256 checksum; for Earth Engine extracts it also records the product and version, the exact date windows used for that harvest year, the spatial scale, mask, method and parameters, the variables present, the number of rows, the date of extraction and the version of the Earth Engine client. The validation report recomputes every checksum, so a file that changes after the manifest was written is detected. Every number, table and figure in this paper is written by the pipeline to files from which the manuscript is generated, so no value is transcribed by hand, and a Streamlit dashboard reads the Gold tables and analysis outputs directly.</w:t>
+        <w:t xml:space="preserve">Every BBS value in the Gold panel carries the yearbook edition and page from which it was read. A manifest written on every run lists each source file and extract with its SHA-256 checksum; for Earth Engine extracts it also records the product and version, the exact date windows used for that harvest year, the spatial scale, mask, method and parameters, the variables present, the number of rows, the date of extraction and the version of the Earth Engine client. The validation report recomputes every checksum, so a file that changes after the manifest was written is detected. Every computed result, table and figure in this paper is written by the pipeline to files from which the manuscript is generated, so no result is transcribed by hand, and a Streamlit dashboard reads the Gold tables and analysis outputs directly.</w:t>
       </w:r>
     </w:p>
     <w:bookmarkEnd w:id="32"/>
@@ -8929,7 +8929,7 @@
         <w:pStyle w:val="FirstParagraph"/>
       </w:pPr>
       <w:r>
-        <w:t xml:space="preserve">The checks verify that each value was extracted correctly and assigned to the correct district and season; they do not verify the BBS survey estimates themselves, which are subject to sampling and revision error and have not been compared here with independent area estimates. The ten failure tests represent common classes of error, not every possible error. The exchanged-lines test shows that a row attributed to the wrong district passes the unit identities and the national total and is caught only by the comparison between editions; in the two crop years printed in a single edition (2010-11 and 2024-25), such an error would not be detected. The validation ranges are wide plausibility bounds and would not detect a plausible but wrong covariate value.</w:t>
+        <w:t xml:space="preserve">The checks verify that each value was extracted correctly and assigned to the correct district and season; they do not verify the BBS survey estimates themselves, which are subject to sampling and revision error and have not been compared here with independent area estimates. A value can also pass every check and still be wrong, if the error is in the publisher’s own tables, is repeated across editions and is included in the printed totals. Chandpur in 2016–17 appears to be such a case: its 110,467 ha is far above the 62,341 ha before and 67,733 ha after, and the yearbooks print the same area for HYV and hybrid Boro that year, about ten times its hybrid area in the adjacent years. We keep the value as printed, because values are never edited by hand, and flag it for users. The ten failure tests represent common classes of error, not every possible error. The exchanged-lines test shows that a row attributed to the wrong district passes the unit identities and the national total and is caught only by the comparison between editions; in the two crop years printed in a single edition (2010-11 and 2024-25), such an error would not be detected. The validation ranges are wide plausibility bounds and would not detect a plausible but wrong covariate value.</w:t>
       </w:r>
     </w:p>
     <w:p>
@@ -8963,7 +8963,7 @@
         <w:pStyle w:val="BodyText"/>
       </w:pPr>
       <w:r>
-        <w:t xml:space="preserve">The 2017 comparison is also consistent with BBS recording crop destroyed before harvest as lost harvested area rather than as lower yield: yield is production divided by harvested area, estimated from crop-cutting surveys on harvested fields (Bangladesh Bureau of Statistics, 2026). In Sunamganj, BBS harvested area and production both fell by 72 % in 2017, while yield was almost unchanged (Table 14). Analyses that relate weather or flood exposure to BBS district yield alone will therefore understate damage from events that destroy whole fields, which is why the panel provides harvested area and production alongside yield.</w:t>
+        <w:t xml:space="preserve">The 2017 comparison is also consistent with BBS recording crop destroyed before harvest as lost harvested area rather than as lower yield. BBS estimates yield from crop cuts on sample plots in fields growing the crop, estimates area separately from sample clusters, and derives production by multiplying the two (Bangladesh Bureau of Statistics, 2026). Its crop report for 2016–17 states that flash flood fully damaged Boro on 296,701 ha, and national Boro area fell by about that amount that year (Bangladesh Bureau of Statistics, 2013–2025). In Sunamganj, BBS harvested area and production both fell by 72 % in 2017, while yield was almost unchanged (Table 14). Analyses that relate weather or flood exposure to BBS district yield alone can therefore understate damage from events that destroy whole fields, which is why the panel provides harvested area and production alongside yield.</w:t>
       </w:r>
     </w:p>
     <w:bookmarkEnd w:id="62"/>

</xml_diff>

<commit_message>
Add data attribution, the ERA5-Land dataset citation and a source anomalies note
</commit_message>
<xml_diff>
--- a/v2/paper_ems/Manuscript_EMS.docx
+++ b/v2/paper_ems/Manuscript_EMS.docx
@@ -213,7 +213,7 @@
         </w:numPr>
       </w:pPr>
       <w:r>
-        <w:t xml:space="preserve">Program size: 3,315 lines of code (174 KB), plus the test scripts</w:t>
+        <w:t xml:space="preserve">Program size: 3,354 lines of code (176 KB), plus the test scripts</w:t>
       </w:r>
     </w:p>
     <w:p>
@@ -1278,7 +1278,7 @@
               <w:pStyle w:val="Compact"/>
             </w:pPr>
             <w:r>
-              <w:t xml:space="preserve">ERA5-Land daily aggregates (Muñoz-Sabater et al., 2021)</w:t>
+              <w:t xml:space="preserve">ERA5-Land daily aggregates (Muñoz-Sabater et al., 2021; Copernicus Climate Change Service, 2019)</w:t>
             </w:r>
           </w:p>
         </w:tc>
@@ -9108,7 +9108,7 @@
         <w:pStyle w:val="FirstParagraph"/>
       </w:pPr>
       <w:r>
-        <w:t xml:space="preserve">The code (MIT licence) and the derived data are available in the repository given in the Software and data availability section and archived at https://doi.org/10.5281/zenodo.23795046; the derived data remain subject to the terms of their sources (Table 2). The BBS yearbook PDFs and the GADM v4.1 boundaries are not redistributed and must be obtained from the Bangladesh Bureau of Statistics and gadm.org; the manifest in the repository lists the SHA-256 checksum of each file used.</w:t>
+        <w:t xml:space="preserve">The code (MIT licence) and the derived data are available in the repository given in the Software and data availability section and archived at https://doi.org/10.5281/zenodo.23795046; the derived data remain subject to the terms of their sources (Table 2). Contains modified Copernicus Sentinel data (2014–2025) and modified Copernicus Climate Change Service information (2026). The BBS yearbook PDFs and the GADM v4.1 boundaries are not redistributed and must be obtained from the Bangladesh Bureau of Statistics and gadm.org; the manifest in the repository lists the SHA-256 checksum of each file used.</w:t>
       </w:r>
     </w:p>
     <w:bookmarkEnd w:id="71"/>
@@ -9183,6 +9183,14 @@
       </w:pPr>
       <w:r>
         <w:t xml:space="preserve">Christen, P., 2012. Data Matching: Concepts and Techniques for Record Linkage, Entity Resolution, and Duplicate Detection. Springer Berlin Heidelberg. https://doi.org/10.1007/978-3-642-31164-2</w:t>
+      </w:r>
+    </w:p>
+    <w:p>
+      <w:pPr>
+        <w:pStyle w:val="BodyText"/>
+      </w:pPr>
+      <w:r>
+        <w:t xml:space="preserve">Copernicus Climate Change Service, 2019. ERA5-Land hourly data from 1950 to present [dataset]. Copernicus Climate Change Service (C3S) Climate Data Store (CDS). https://doi.org/10.24381/cds.e2161bac</w:t>
       </w:r>
     </w:p>
     <w:p>

</xml_diff>